<commit_message>
research: publish matched actor timing portable PPO kit and corrected report drafts
</commit_message>
<xml_diff>
--- a/docs/research/reviewer-causal-v1/opening-report-revised-draft.docx
+++ b/docs/research/reviewer-causal-v1/opening-report-revised-draft.docx
@@ -1082,68 +1082,208 @@
       <w:pPr>
         <w:pStyle w:val="BodyText"/>
       </w:pPr>
-      <w:r>
-        <w:t xml:space="preserve">[</w:t>
-      </w:r>
-      <w:r>
-        <w:t xml:space="preserve"> </w:t>
-      </w:r>
-      <w:r>
-        <w:rPr>
-          <w:i/>
-          <w:iCs/>
-        </w:rPr>
-        <w:t xml:space="preserve">{</w:t>
-      </w:r>
-      <w:r>
-        <w:rPr>
-          <w:i/>
-          <w:iCs/>
-        </w:rPr>
-        <w:t xml:space="preserve">,t}=</w:t>
-      </w:r>
-      <w:r>
-        <w:t xml:space="preserve">{[-0.5,0.5]}</w:t>
-      </w:r>
-      <w:r>
-        <w:t xml:space="preserve"> </w:t>
-      </w:r>
-      <w:r>
-        <w:t xml:space="preserve">(</w:t>
-      </w:r>
-      <w:r>
-        <w:rPr>
-          <w:i/>
-          <w:iCs/>
-        </w:rPr>
-        <w:t xml:space="preserve">{</w:t>
-      </w:r>
-      <w:r>
-        <w:rPr>
-          <w:i/>
-          <w:iCs/>
-        </w:rPr>
-        <w:t xml:space="preserve">,t}+w_t</w:t>
-      </w:r>
-      <w:r>
-        <w:t xml:space="preserve">{</w:t>
-      </w:r>
-      <w:r>
-        <w:t xml:space="preserve">,t}</w:t>
-      </w:r>
-      <w:r>
-        <w:t xml:space="preserve">).</w:t>
-      </w:r>
-      <w:r>
-        <w:t xml:space="preserve"> </w:t>
-      </w:r>
-      <w:r>
-        <w:t xml:space="preserve">]</w:t>
-      </w:r>
-    </w:p>
-    <w:p>
-      <w:pPr>
-        <w:pStyle w:val="BodyText"/>
+      <m:oMathPara>
+        <m:oMathParaPr>
+          <m:jc m:val="center"/>
+        </m:oMathParaPr>
+        <m:oMath>
+          <m:sSub>
+            <m:e>
+              <m:r>
+                <m:t>δ</m:t>
+              </m:r>
+            </m:e>
+            <m:sub>
+              <m:r>
+                <m:rPr>
+                  <m:sty m:val="p"/>
+                </m:rPr>
+                <m:t>c</m:t>
+              </m:r>
+              <m:r>
+                <m:rPr>
+                  <m:sty m:val="p"/>
+                </m:rPr>
+                <m:t>m</m:t>
+              </m:r>
+              <m:r>
+                <m:rPr>
+                  <m:sty m:val="p"/>
+                </m:rPr>
+                <m:t>d</m:t>
+              </m:r>
+              <m:r>
+                <m:rPr>
+                  <m:sty m:val="p"/>
+                </m:rPr>
+                <m:t>,</m:t>
+              </m:r>
+              <m:r>
+                <m:t>t</m:t>
+              </m:r>
+            </m:sub>
+          </m:sSub>
+          <m:r>
+            <m:rPr>
+              <m:sty m:val="p"/>
+            </m:rPr>
+            <m:t>=</m:t>
+          </m:r>
+          <m:sSub>
+            <m:e>
+              <m:r>
+                <m:rPr>
+                  <m:sty m:val="p"/>
+                </m:rPr>
+                <m:t>sat</m:t>
+              </m:r>
+            </m:e>
+            <m:sub>
+              <m:d>
+                <m:dPr>
+                  <m:begChr m:val="["/>
+                  <m:endChr m:val="]"/>
+                  <m:sepChr m:val=""/>
+                  <m:grow/>
+                </m:dPr>
+                <m:e>
+                  <m:r>
+                    <m:rPr>
+                      <m:sty m:val="p"/>
+                    </m:rPr>
+                    <m:t>−</m:t>
+                  </m:r>
+                  <m:r>
+                    <m:t>0.5</m:t>
+                  </m:r>
+                  <m:r>
+                    <m:rPr>
+                      <m:sty m:val="p"/>
+                    </m:rPr>
+                    <m:t>,</m:t>
+                  </m:r>
+                  <m:r>
+                    <m:t>0.5</m:t>
+                  </m:r>
+                </m:e>
+              </m:d>
+            </m:sub>
+          </m:sSub>
+          <m:d>
+            <m:dPr>
+              <m:begChr m:val="("/>
+              <m:endChr m:val=")"/>
+              <m:sepChr m:val=""/>
+              <m:grow/>
+            </m:dPr>
+            <m:e>
+              <m:sSub>
+                <m:e>
+                  <m:r>
+                    <m:t>δ</m:t>
+                  </m:r>
+                </m:e>
+                <m:sub>
+                  <m:r>
+                    <m:rPr>
+                      <m:sty m:val="p"/>
+                    </m:rPr>
+                    <m:t>L</m:t>
+                  </m:r>
+                  <m:r>
+                    <m:rPr>
+                      <m:sty m:val="p"/>
+                    </m:rPr>
+                    <m:t>Q</m:t>
+                  </m:r>
+                  <m:r>
+                    <m:rPr>
+                      <m:sty m:val="p"/>
+                    </m:rPr>
+                    <m:t>R</m:t>
+                  </m:r>
+                  <m:r>
+                    <m:rPr>
+                      <m:sty m:val="p"/>
+                    </m:rPr>
+                    <m:t>,</m:t>
+                  </m:r>
+                  <m:r>
+                    <m:t>t</m:t>
+                  </m:r>
+                </m:sub>
+              </m:sSub>
+              <m:r>
+                <m:rPr>
+                  <m:sty m:val="p"/>
+                </m:rPr>
+                <m:t>+</m:t>
+              </m:r>
+              <m:sSub>
+                <m:e>
+                  <m:r>
+                    <m:t>w</m:t>
+                  </m:r>
+                </m:e>
+                <m:sub>
+                  <m:r>
+                    <m:t>t</m:t>
+                  </m:r>
+                </m:sub>
+              </m:sSub>
+              <m:r>
+                <m:t>Δ</m:t>
+              </m:r>
+              <m:sSub>
+                <m:e>
+                  <m:r>
+                    <m:t>δ</m:t>
+                  </m:r>
+                </m:e>
+                <m:sub>
+                  <m:r>
+                    <m:rPr>
+                      <m:sty m:val="p"/>
+                    </m:rPr>
+                    <m:t>s</m:t>
+                  </m:r>
+                  <m:r>
+                    <m:rPr>
+                      <m:sty m:val="p"/>
+                    </m:rPr>
+                    <m:t>e</m:t>
+                  </m:r>
+                  <m:r>
+                    <m:rPr>
+                      <m:sty m:val="p"/>
+                    </m:rPr>
+                    <m:t>l</m:t>
+                  </m:r>
+                  <m:r>
+                    <m:rPr>
+                      <m:sty m:val="p"/>
+                    </m:rPr>
+                    <m:t>,</m:t>
+                  </m:r>
+                  <m:r>
+                    <m:t>t</m:t>
+                  </m:r>
+                </m:sub>
+              </m:sSub>
+            </m:e>
+          </m:d>
+          <m:r>
+            <m:rPr>
+              <m:sty m:val="p"/>
+            </m:rPr>
+            <m:t>.</m:t>
+          </m:r>
+        </m:oMath>
+      </m:oMathPara>
+    </w:p>
+    <w:p>
+      <w:pPr>
+        <w:pStyle w:val="FirstParagraph"/>
       </w:pPr>
       <w:r>
         <w:t xml:space="preserve">The selected residual is unweighted; fusion applies</w:t>
@@ -1360,98 +1500,427 @@
       <w:pPr>
         <w:pStyle w:val="BodyText"/>
       </w:pPr>
-      <w:r>
-        <w:t xml:space="preserve">[</w:t>
-      </w:r>
-      <w:r>
-        <w:t xml:space="preserve"> </w:t>
-      </w:r>
-      <w:r>
-        <w:t xml:space="preserve">X=v_x</w:t>
-      </w:r>
-      <w:r>
-        <w:t xml:space="preserve">-v_y</w:t>
-      </w:r>
-      <w:r>
-        <w:t xml:space="preserve">,</w:t>
-      </w:r>
-      <w:r>
-        <w:t xml:space="preserve"> </w:t>
-      </w:r>
-      <w:r>
-        <w:t xml:space="preserve">Y=v_x</w:t>
-      </w:r>
-      <w:r>
-        <w:t xml:space="preserve">+v_y</w:t>
-      </w:r>
-      <w:r>
-        <w:t xml:space="preserve">,</w:t>
-      </w:r>
-      <w:r>
-        <w:t xml:space="preserve">=r,</w:t>
-      </w:r>
-      <w:r>
-        <w:t xml:space="preserve"> </w:t>
-      </w:r>
-      <w:r>
-        <w:t xml:space="preserve">]</w:t>
-      </w:r>
-    </w:p>
-    <w:p>
-      <w:pPr>
-        <w:pStyle w:val="BodyText"/>
-      </w:pPr>
-      <w:r>
-        <w:t xml:space="preserve">[</w:t>
-      </w:r>
-      <w:r>
-        <w:t xml:space="preserve"> </w:t>
-      </w:r>
-      <w:r>
-        <w:t xml:space="preserve">m</w:t>
-      </w:r>
-      <w:r>
-        <w:t xml:space="preserve">v_y=F_{yf}</w:t>
-      </w:r>
-      <w:r>
-        <w:rPr>
-          <w:i/>
-          <w:iCs/>
-        </w:rPr>
-        <w:t xml:space="preserve">a+F</w:t>
-      </w:r>
-      <w:r>
-        <w:t xml:space="preserve">{yr}-mv_xr,</w:t>
-      </w:r>
-      <w:r>
-        <w:t xml:space="preserve"> </w:t>
-      </w:r>
-      <w:r>
-        <w:t xml:space="preserve">I_z</w:t>
-      </w:r>
-      <w:r>
-        <w:t xml:space="preserve">r=l_fF_{yf}</w:t>
-      </w:r>
-      <w:r>
-        <w:rPr>
-          <w:i/>
-          <w:iCs/>
-        </w:rPr>
-        <w:t xml:space="preserve">a-l_rF</w:t>
-      </w:r>
-      <w:r>
-        <w:t xml:space="preserve">{yr}.</w:t>
-      </w:r>
-      <w:r>
-        <w:t xml:space="preserve"> </w:t>
-      </w:r>
-      <w:r>
-        <w:t xml:space="preserve">]</w:t>
-      </w:r>
-    </w:p>
-    <w:p>
-      <w:pPr>
-        <w:pStyle w:val="BodyText"/>
+      <m:oMathPara>
+        <m:oMathParaPr>
+          <m:jc m:val="center"/>
+        </m:oMathParaPr>
+        <m:oMath>
+          <m:acc>
+            <m:accPr>
+              <m:chr m:val="̇"/>
+            </m:accPr>
+            <m:e>
+              <m:r>
+                <m:t>X</m:t>
+              </m:r>
+            </m:e>
+          </m:acc>
+          <m:r>
+            <m:rPr>
+              <m:sty m:val="p"/>
+            </m:rPr>
+            <m:t>=</m:t>
+          </m:r>
+          <m:sSub>
+            <m:e>
+              <m:r>
+                <m:t>v</m:t>
+              </m:r>
+            </m:e>
+            <m:sub>
+              <m:r>
+                <m:t>x</m:t>
+              </m:r>
+            </m:sub>
+          </m:sSub>
+          <m:r>
+            <m:rPr>
+              <m:sty m:val="p"/>
+            </m:rPr>
+            <m:t>cos</m:t>
+          </m:r>
+          <m:r>
+            <m:t>ψ</m:t>
+          </m:r>
+          <m:r>
+            <m:rPr>
+              <m:sty m:val="p"/>
+            </m:rPr>
+            <m:t>−</m:t>
+          </m:r>
+          <m:sSub>
+            <m:e>
+              <m:r>
+                <m:t>v</m:t>
+              </m:r>
+            </m:e>
+            <m:sub>
+              <m:r>
+                <m:t>y</m:t>
+              </m:r>
+            </m:sub>
+          </m:sSub>
+          <m:r>
+            <m:rPr>
+              <m:sty m:val="p"/>
+            </m:rPr>
+            <m:t>sin</m:t>
+          </m:r>
+          <m:r>
+            <m:t>ψ</m:t>
+          </m:r>
+          <m:r>
+            <m:rPr>
+              <m:sty m:val="p"/>
+            </m:rPr>
+            <m:t>,</m:t>
+          </m:r>
+          <m:r>
+            <m:t> </m:t>
+          </m:r>
+          <m:acc>
+            <m:accPr>
+              <m:chr m:val="̇"/>
+            </m:accPr>
+            <m:e>
+              <m:r>
+                <m:t>Y</m:t>
+              </m:r>
+            </m:e>
+          </m:acc>
+          <m:r>
+            <m:rPr>
+              <m:sty m:val="p"/>
+            </m:rPr>
+            <m:t>=</m:t>
+          </m:r>
+          <m:sSub>
+            <m:e>
+              <m:r>
+                <m:t>v</m:t>
+              </m:r>
+            </m:e>
+            <m:sub>
+              <m:r>
+                <m:t>x</m:t>
+              </m:r>
+            </m:sub>
+          </m:sSub>
+          <m:r>
+            <m:rPr>
+              <m:sty m:val="p"/>
+            </m:rPr>
+            <m:t>sin</m:t>
+          </m:r>
+          <m:r>
+            <m:t>ψ</m:t>
+          </m:r>
+          <m:r>
+            <m:rPr>
+              <m:sty m:val="p"/>
+            </m:rPr>
+            <m:t>+</m:t>
+          </m:r>
+          <m:sSub>
+            <m:e>
+              <m:r>
+                <m:t>v</m:t>
+              </m:r>
+            </m:e>
+            <m:sub>
+              <m:r>
+                <m:t>y</m:t>
+              </m:r>
+            </m:sub>
+          </m:sSub>
+          <m:r>
+            <m:rPr>
+              <m:sty m:val="p"/>
+            </m:rPr>
+            <m:t>cos</m:t>
+          </m:r>
+          <m:r>
+            <m:t>ψ</m:t>
+          </m:r>
+          <m:r>
+            <m:rPr>
+              <m:sty m:val="p"/>
+            </m:rPr>
+            <m:t>,</m:t>
+          </m:r>
+          <m:r>
+            <m:t> </m:t>
+          </m:r>
+          <m:acc>
+            <m:accPr>
+              <m:chr m:val="̇"/>
+            </m:accPr>
+            <m:e>
+              <m:r>
+                <m:t>ψ</m:t>
+              </m:r>
+            </m:e>
+          </m:acc>
+          <m:r>
+            <m:rPr>
+              <m:sty m:val="p"/>
+            </m:rPr>
+            <m:t>=</m:t>
+          </m:r>
+          <m:r>
+            <m:t>r</m:t>
+          </m:r>
+          <m:r>
+            <m:rPr>
+              <m:sty m:val="p"/>
+            </m:rPr>
+            <m:t>,</m:t>
+          </m:r>
+        </m:oMath>
+      </m:oMathPara>
+    </w:p>
+    <w:p>
+      <w:pPr>
+        <w:pStyle w:val="FirstParagraph"/>
+      </w:pPr>
+      <m:oMathPara>
+        <m:oMathParaPr>
+          <m:jc m:val="center"/>
+        </m:oMathParaPr>
+        <m:oMath>
+          <m:r>
+            <m:t>m</m:t>
+          </m:r>
+          <m:sSub>
+            <m:e>
+              <m:acc>
+                <m:accPr>
+                  <m:chr m:val="̇"/>
+                </m:accPr>
+                <m:e>
+                  <m:r>
+                    <m:t>v</m:t>
+                  </m:r>
+                </m:e>
+              </m:acc>
+            </m:e>
+            <m:sub>
+              <m:r>
+                <m:t>y</m:t>
+              </m:r>
+            </m:sub>
+          </m:sSub>
+          <m:r>
+            <m:rPr>
+              <m:sty m:val="p"/>
+            </m:rPr>
+            <m:t>=</m:t>
+          </m:r>
+          <m:sSub>
+            <m:e>
+              <m:r>
+                <m:t>F</m:t>
+              </m:r>
+            </m:e>
+            <m:sub>
+              <m:r>
+                <m:t>y</m:t>
+              </m:r>
+              <m:r>
+                <m:t>f</m:t>
+              </m:r>
+            </m:sub>
+          </m:sSub>
+          <m:r>
+            <m:rPr>
+              <m:sty m:val="p"/>
+            </m:rPr>
+            <m:t>cos</m:t>
+          </m:r>
+          <m:sSub>
+            <m:e>
+              <m:r>
+                <m:t>δ</m:t>
+              </m:r>
+            </m:e>
+            <m:sub>
+              <m:r>
+                <m:t>a</m:t>
+              </m:r>
+            </m:sub>
+          </m:sSub>
+          <m:r>
+            <m:rPr>
+              <m:sty m:val="p"/>
+            </m:rPr>
+            <m:t>+</m:t>
+          </m:r>
+          <m:sSub>
+            <m:e>
+              <m:r>
+                <m:t>F</m:t>
+              </m:r>
+            </m:e>
+            <m:sub>
+              <m:r>
+                <m:t>y</m:t>
+              </m:r>
+              <m:r>
+                <m:t>r</m:t>
+              </m:r>
+            </m:sub>
+          </m:sSub>
+          <m:r>
+            <m:rPr>
+              <m:sty m:val="p"/>
+            </m:rPr>
+            <m:t>−</m:t>
+          </m:r>
+          <m:r>
+            <m:t>m</m:t>
+          </m:r>
+          <m:sSub>
+            <m:e>
+              <m:r>
+                <m:t>v</m:t>
+              </m:r>
+            </m:e>
+            <m:sub>
+              <m:r>
+                <m:t>x</m:t>
+              </m:r>
+            </m:sub>
+          </m:sSub>
+          <m:r>
+            <m:t>r</m:t>
+          </m:r>
+          <m:r>
+            <m:rPr>
+              <m:sty m:val="p"/>
+            </m:rPr>
+            <m:t>,</m:t>
+          </m:r>
+          <m:r>
+            <m:t>  </m:t>
+          </m:r>
+          <m:sSub>
+            <m:e>
+              <m:r>
+                <m:t>I</m:t>
+              </m:r>
+            </m:e>
+            <m:sub>
+              <m:r>
+                <m:t>z</m:t>
+              </m:r>
+            </m:sub>
+          </m:sSub>
+          <m:acc>
+            <m:accPr>
+              <m:chr m:val="̇"/>
+            </m:accPr>
+            <m:e>
+              <m:r>
+                <m:t>r</m:t>
+              </m:r>
+            </m:e>
+          </m:acc>
+          <m:r>
+            <m:rPr>
+              <m:sty m:val="p"/>
+            </m:rPr>
+            <m:t>=</m:t>
+          </m:r>
+          <m:sSub>
+            <m:e>
+              <m:r>
+                <m:t>l</m:t>
+              </m:r>
+            </m:e>
+            <m:sub>
+              <m:r>
+                <m:t>f</m:t>
+              </m:r>
+            </m:sub>
+          </m:sSub>
+          <m:sSub>
+            <m:e>
+              <m:r>
+                <m:t>F</m:t>
+              </m:r>
+            </m:e>
+            <m:sub>
+              <m:r>
+                <m:t>y</m:t>
+              </m:r>
+              <m:r>
+                <m:t>f</m:t>
+              </m:r>
+            </m:sub>
+          </m:sSub>
+          <m:r>
+            <m:rPr>
+              <m:sty m:val="p"/>
+            </m:rPr>
+            <m:t>cos</m:t>
+          </m:r>
+          <m:sSub>
+            <m:e>
+              <m:r>
+                <m:t>δ</m:t>
+              </m:r>
+            </m:e>
+            <m:sub>
+              <m:r>
+                <m:t>a</m:t>
+              </m:r>
+            </m:sub>
+          </m:sSub>
+          <m:r>
+            <m:rPr>
+              <m:sty m:val="p"/>
+            </m:rPr>
+            <m:t>−</m:t>
+          </m:r>
+          <m:sSub>
+            <m:e>
+              <m:r>
+                <m:t>l</m:t>
+              </m:r>
+            </m:e>
+            <m:sub>
+              <m:r>
+                <m:t>r</m:t>
+              </m:r>
+            </m:sub>
+          </m:sSub>
+          <m:sSub>
+            <m:e>
+              <m:r>
+                <m:t>F</m:t>
+              </m:r>
+            </m:e>
+            <m:sub>
+              <m:r>
+                <m:t>y</m:t>
+              </m:r>
+              <m:r>
+                <m:t>r</m:t>
+              </m:r>
+            </m:sub>
+          </m:sSub>
+          <m:r>
+            <m:rPr>
+              <m:sty m:val="p"/>
+            </m:rPr>
+            <m:t>.</m:t>
+          </m:r>
+        </m:oMath>
+      </m:oMathPara>
+    </w:p>
+    <w:p>
+      <w:pPr>
+        <w:pStyle w:val="FirstParagraph"/>
       </w:pPr>
       <w:r>
         <w:t xml:space="preserve">Tire inputs are</w:t>
@@ -1700,27 +2169,326 @@
       <w:pPr>
         <w:pStyle w:val="BodyText"/>
       </w:pPr>
-      <w:r>
-        <w:t xml:space="preserve">[</w:t>
-      </w:r>
-      <w:r>
-        <w:t xml:space="preserve"> </w:t>
-      </w:r>
-      <w:r>
-        <w:t xml:space="preserve">F_y=</w:t>
-      </w:r>
-    </w:p>
-    <w:p>
-      <w:pPr>
-        <w:pStyle w:val="BodyText"/>
-      </w:pPr>
-      <w:r>
-        <w:t xml:space="preserve">]</w:t>
-      </w:r>
-    </w:p>
-    <w:p>
-      <w:pPr>
-        <w:pStyle w:val="BodyText"/>
+      <m:oMathPara>
+        <m:oMathParaPr>
+          <m:jc m:val="center"/>
+        </m:oMathParaPr>
+        <m:oMath>
+          <m:sSub>
+            <m:e>
+              <m:r>
+                <m:t>F</m:t>
+              </m:r>
+            </m:e>
+            <m:sub>
+              <m:r>
+                <m:t>y</m:t>
+              </m:r>
+            </m:sub>
+          </m:sSub>
+          <m:r>
+            <m:rPr>
+              <m:sty m:val="p"/>
+            </m:rPr>
+            <m:t>=</m:t>
+          </m:r>
+          <m:d>
+            <m:dPr>
+              <m:begChr m:val="{"/>
+              <m:endChr m:val=""/>
+              <m:sepChr m:val=""/>
+              <m:grow/>
+            </m:dPr>
+            <m:e>
+              <m:m>
+                <m:mPr>
+                  <m:baseJc m:val="center"/>
+                  <m:plcHide m:val="on"/>
+                  <m:mcs>
+                    <m:mc>
+                      <m:mcPr>
+                        <m:mcJc m:val="left"/>
+                        <m:count m:val="1"/>
+                      </m:mcPr>
+                    </m:mc>
+                    <m:mc>
+                      <m:mcPr>
+                        <m:mcJc m:val="left"/>
+                        <m:count m:val="1"/>
+                      </m:mcPr>
+                    </m:mc>
+                  </m:mcs>
+                </m:mPr>
+                <m:mr>
+                  <m:e>
+                    <m:r>
+                      <m:t>C</m:t>
+                    </m:r>
+                    <m:r>
+                      <m:t>z</m:t>
+                    </m:r>
+                    <m:r>
+                      <m:rPr>
+                        <m:sty m:val="p"/>
+                      </m:rPr>
+                      <m:t>−</m:t>
+                    </m:r>
+                    <m:f>
+                      <m:fPr>
+                        <m:type m:val="bar"/>
+                      </m:fPr>
+                      <m:num>
+                        <m:sSup>
+                          <m:e>
+                            <m:r>
+                              <m:t>C</m:t>
+                            </m:r>
+                          </m:e>
+                          <m:sup>
+                            <m:r>
+                              <m:t>2</m:t>
+                            </m:r>
+                          </m:sup>
+                        </m:sSup>
+                      </m:num>
+                      <m:den>
+                        <m:r>
+                          <m:t>3</m:t>
+                        </m:r>
+                        <m:r>
+                          <m:t>μ</m:t>
+                        </m:r>
+                        <m:sSub>
+                          <m:e>
+                            <m:r>
+                              <m:t>F</m:t>
+                            </m:r>
+                          </m:e>
+                          <m:sub>
+                            <m:r>
+                              <m:t>z</m:t>
+                            </m:r>
+                          </m:sub>
+                        </m:sSub>
+                      </m:den>
+                    </m:f>
+                    <m:d>
+                      <m:dPr>
+                        <m:begChr m:val="|"/>
+                        <m:endChr m:val="|"/>
+                        <m:sepChr m:val=""/>
+                        <m:grow/>
+                      </m:dPr>
+                      <m:e>
+                        <m:r>
+                          <m:t>z</m:t>
+                        </m:r>
+                      </m:e>
+                    </m:d>
+                    <m:r>
+                      <m:t>z</m:t>
+                    </m:r>
+                    <m:r>
+                      <m:rPr>
+                        <m:sty m:val="p"/>
+                      </m:rPr>
+                      <m:t>+</m:t>
+                    </m:r>
+                    <m:f>
+                      <m:fPr>
+                        <m:type m:val="bar"/>
+                      </m:fPr>
+                      <m:num>
+                        <m:sSup>
+                          <m:e>
+                            <m:r>
+                              <m:t>C</m:t>
+                            </m:r>
+                          </m:e>
+                          <m:sup>
+                            <m:r>
+                              <m:t>3</m:t>
+                            </m:r>
+                          </m:sup>
+                        </m:sSup>
+                      </m:num>
+                      <m:den>
+                        <m:r>
+                          <m:t>27</m:t>
+                        </m:r>
+                        <m:sSup>
+                          <m:e>
+                            <m:r>
+                              <m:t>μ</m:t>
+                            </m:r>
+                          </m:e>
+                          <m:sup>
+                            <m:r>
+                              <m:t>2</m:t>
+                            </m:r>
+                          </m:sup>
+                        </m:sSup>
+                        <m:sSubSup>
+                          <m:e>
+                            <m:r>
+                              <m:t>F</m:t>
+                            </m:r>
+                          </m:e>
+                          <m:sub>
+                            <m:r>
+                              <m:t>z</m:t>
+                            </m:r>
+                          </m:sub>
+                          <m:sup>
+                            <m:r>
+                              <m:t>2</m:t>
+                            </m:r>
+                          </m:sup>
+                        </m:sSubSup>
+                      </m:den>
+                    </m:f>
+                    <m:sSup>
+                      <m:e>
+                        <m:r>
+                          <m:t>z</m:t>
+                        </m:r>
+                      </m:e>
+                      <m:sup>
+                        <m:r>
+                          <m:t>3</m:t>
+                        </m:r>
+                      </m:sup>
+                    </m:sSup>
+                    <m:r>
+                      <m:rPr>
+                        <m:sty m:val="p"/>
+                      </m:rPr>
+                      <m:t>,</m:t>
+                    </m:r>
+                  </m:e>
+                  <m:e>
+                    <m:d>
+                      <m:dPr>
+                        <m:begChr m:val="|"/>
+                        <m:endChr m:val="|"/>
+                        <m:sepChr m:val=""/>
+                        <m:grow/>
+                      </m:dPr>
+                      <m:e>
+                        <m:r>
+                          <m:t>z</m:t>
+                        </m:r>
+                      </m:e>
+                    </m:d>
+                    <m:r>
+                      <m:rPr>
+                        <m:sty m:val="p"/>
+                      </m:rPr>
+                      <m:t>&lt;</m:t>
+                    </m:r>
+                    <m:r>
+                      <m:t>3</m:t>
+                    </m:r>
+                    <m:r>
+                      <m:t>μ</m:t>
+                    </m:r>
+                    <m:sSub>
+                      <m:e>
+                        <m:r>
+                          <m:t>F</m:t>
+                        </m:r>
+                      </m:e>
+                      <m:sub>
+                        <m:r>
+                          <m:t>z</m:t>
+                        </m:r>
+                      </m:sub>
+                    </m:sSub>
+                    <m:r>
+                      <m:rPr>
+                        <m:sty m:val="p"/>
+                      </m:rPr>
+                      <m:t>/</m:t>
+                    </m:r>
+                    <m:r>
+                      <m:t>C</m:t>
+                    </m:r>
+                    <m:r>
+                      <m:rPr>
+                        <m:sty m:val="p"/>
+                      </m:rPr>
+                      <m:t>,</m:t>
+                    </m:r>
+                  </m:e>
+                </m:mr>
+                <m:mr>
+                  <m:e>
+                    <m:r>
+                      <m:t>μ</m:t>
+                    </m:r>
+                    <m:sSub>
+                      <m:e>
+                        <m:r>
+                          <m:t>F</m:t>
+                        </m:r>
+                      </m:e>
+                      <m:sub>
+                        <m:r>
+                          <m:t>z</m:t>
+                        </m:r>
+                      </m:sub>
+                    </m:sSub>
+                    <m:r>
+                      <m:rPr>
+                        <m:sty m:val="p"/>
+                      </m:rPr>
+                      <m:t>sgn</m:t>
+                    </m:r>
+                    <m:d>
+                      <m:dPr>
+                        <m:begChr m:val="("/>
+                        <m:endChr m:val=")"/>
+                        <m:sepChr m:val=""/>
+                        <m:grow/>
+                      </m:dPr>
+                      <m:e>
+                        <m:r>
+                          <m:t>z</m:t>
+                        </m:r>
+                      </m:e>
+                    </m:d>
+                    <m:r>
+                      <m:rPr>
+                        <m:sty m:val="p"/>
+                      </m:rPr>
+                      <m:t>,</m:t>
+                    </m:r>
+                  </m:e>
+                  <m:e>
+                    <m:r>
+                      <m:rPr>
+                        <m:nor/>
+                        <m:sty m:val="p"/>
+                      </m:rPr>
+                      <m:t>otherwise</m:t>
+                    </m:r>
+                    <m:r>
+                      <m:rPr>
+                        <m:sty m:val="p"/>
+                      </m:rPr>
+                      <m:t>.</m:t>
+                    </m:r>
+                  </m:e>
+                </m:mr>
+              </m:m>
+            </m:e>
+          </m:d>
+        </m:oMath>
+      </m:oMathPara>
+    </w:p>
+    <w:p>
+      <w:pPr>
+        <w:pStyle w:val="FirstParagraph"/>
       </w:pPr>
       <w:r>
         <w:t xml:space="preserve">Nominal parameters are</w:t>
@@ -1913,55 +2681,152 @@
       <w:pPr>
         <w:pStyle w:val="BodyText"/>
       </w:pPr>
-      <w:r>
-        <w:t xml:space="preserve">[</w:t>
-      </w:r>
-      <w:r>
-        <w:t xml:space="preserve"> </w:t>
-      </w:r>
-      <w:r>
-        <w:rPr>
-          <w:i/>
-          <w:iCs/>
-        </w:rPr>
-        <w:t xml:space="preserve">a=</w:t>
-      </w:r>
-      <w:r>
-        <w:rPr>
-          <w:i/>
-          <w:iCs/>
-        </w:rPr>
-        <w:t xml:space="preserve"> </w:t>
-      </w:r>
-      <w:r>
-        <w:rPr>
-          <w:i/>
-          <w:iCs/>
-        </w:rPr>
-        <w:t xml:space="preserve">((</w:t>
-      </w:r>
-      <w:r>
-        <w:t xml:space="preserve">{</w:t>
-      </w:r>
-      <w:r>
-        <w:t xml:space="preserve">}-</w:t>
-      </w:r>
-      <w:r>
-        <w:t xml:space="preserve">_a)/0.05,-0.35,0.35</w:t>
-      </w:r>
-      <w:r>
-        <w:t xml:space="preserve">).</w:t>
-      </w:r>
-      <w:r>
-        <w:t xml:space="preserve"> </w:t>
-      </w:r>
-      <w:r>
-        <w:t xml:space="preserve">]</w:t>
-      </w:r>
-    </w:p>
-    <w:p>
-      <w:pPr>
-        <w:pStyle w:val="BodyText"/>
+      <m:oMathPara>
+        <m:oMathParaPr>
+          <m:jc m:val="center"/>
+        </m:oMathParaPr>
+        <m:oMath>
+          <m:sSub>
+            <m:e>
+              <m:acc>
+                <m:accPr>
+                  <m:chr m:val="̇"/>
+                </m:accPr>
+                <m:e>
+                  <m:r>
+                    <m:t>δ</m:t>
+                  </m:r>
+                </m:e>
+              </m:acc>
+            </m:e>
+            <m:sub>
+              <m:r>
+                <m:t>a</m:t>
+              </m:r>
+            </m:sub>
+          </m:sSub>
+          <m:r>
+            <m:rPr>
+              <m:sty m:val="p"/>
+            </m:rPr>
+            <m:t>=</m:t>
+          </m:r>
+          <m:r>
+            <m:rPr>
+              <m:sty m:val="p"/>
+            </m:rPr>
+            <m:t>clip</m:t>
+          </m:r>
+          <m:d>
+            <m:dPr>
+              <m:begChr m:val="("/>
+              <m:endChr m:val=")"/>
+              <m:sepChr m:val=""/>
+              <m:grow/>
+            </m:dPr>
+            <m:e>
+              <m:d>
+                <m:dPr>
+                  <m:begChr m:val="("/>
+                  <m:endChr m:val=")"/>
+                  <m:sepChr m:val=""/>
+                  <m:grow/>
+                </m:dPr>
+                <m:e>
+                  <m:sSub>
+                    <m:e>
+                      <m:r>
+                        <m:t>δ</m:t>
+                      </m:r>
+                    </m:e>
+                    <m:sub>
+                      <m:r>
+                        <m:rPr>
+                          <m:sty m:val="p"/>
+                        </m:rPr>
+                        <m:t>c</m:t>
+                      </m:r>
+                      <m:r>
+                        <m:rPr>
+                          <m:sty m:val="p"/>
+                        </m:rPr>
+                        <m:t>m</m:t>
+                      </m:r>
+                      <m:r>
+                        <m:rPr>
+                          <m:sty m:val="p"/>
+                        </m:rPr>
+                        <m:t>d</m:t>
+                      </m:r>
+                    </m:sub>
+                  </m:sSub>
+                  <m:r>
+                    <m:rPr>
+                      <m:sty m:val="p"/>
+                    </m:rPr>
+                    <m:t>−</m:t>
+                  </m:r>
+                  <m:sSub>
+                    <m:e>
+                      <m:r>
+                        <m:t>δ</m:t>
+                      </m:r>
+                    </m:e>
+                    <m:sub>
+                      <m:r>
+                        <m:t>a</m:t>
+                      </m:r>
+                    </m:sub>
+                  </m:sSub>
+                </m:e>
+              </m:d>
+              <m:r>
+                <m:rPr>
+                  <m:sty m:val="p"/>
+                </m:rPr>
+                <m:t>/</m:t>
+              </m:r>
+              <m:r>
+                <m:t>0.05</m:t>
+              </m:r>
+              <m:r>
+                <m:rPr>
+                  <m:sty m:val="p"/>
+                </m:rPr>
+                <m:t>,</m:t>
+              </m:r>
+              <m:r>
+                <m:rPr>
+                  <m:sty m:val="p"/>
+                </m:rPr>
+                <m:t>−</m:t>
+              </m:r>
+              <m:r>
+                <m:t>0.35</m:t>
+              </m:r>
+              <m:r>
+                <m:rPr>
+                  <m:sty m:val="p"/>
+                </m:rPr>
+                <m:t>,</m:t>
+              </m:r>
+              <m:r>
+                <m:t>0.35</m:t>
+              </m:r>
+            </m:e>
+          </m:d>
+          <m:r>
+            <m:rPr>
+              <m:sty m:val="p"/>
+            </m:rPr>
+            <m:t>.</m:t>
+          </m:r>
+        </m:oMath>
+      </m:oMathPara>
+    </w:p>
+    <w:p>
+      <w:pPr>
+        <w:pStyle w:val="FirstParagraph"/>
       </w:pPr>
       <w:r>
         <w:t xml:space="preserve">Command and actuator angles are limited to0.5rad. Longitudinal control, obstacles,</w:t>
@@ -2532,44 +3397,175 @@
       <w:pPr>
         <w:pStyle w:val="BodyText"/>
       </w:pPr>
-      <w:r>
-        <w:t xml:space="preserve">[</w:t>
-      </w:r>
-      <w:r>
-        <w:t xml:space="preserve"> </w:t>
-      </w:r>
-      <w:r>
-        <w:rPr>
-          <w:i/>
-          <w:iCs/>
-        </w:rPr>
-        <w:t xml:space="preserve">{</w:t>
-      </w:r>
-      <w:r>
-        <w:rPr>
-          <w:i/>
-          <w:iCs/>
-        </w:rPr>
-        <w:t xml:space="preserve">}=</w:t>
-      </w:r>
-      <w:r>
-        <w:t xml:space="preserve">{</w:t>
-      </w:r>
-      <w:r>
-        <w:t xml:space="preserve">}-K(v_x)(</w:t>
-      </w:r>
-      <w:r>
-        <w:t xml:space="preserve">x_e-x_{e,</w:t>
-      </w:r>
-      <w:r>
-        <w:t xml:space="preserve">}).</w:t>
-      </w:r>
-      <w:r>
-        <w:t xml:space="preserve"> </w:t>
-      </w:r>
-      <w:r>
-        <w:t xml:space="preserve">]</w:t>
-      </w:r>
+      <m:oMathPara>
+        <m:oMathParaPr>
+          <m:jc m:val="center"/>
+        </m:oMathParaPr>
+        <m:oMath>
+          <m:sSub>
+            <m:e>
+              <m:r>
+                <m:t>δ</m:t>
+              </m:r>
+            </m:e>
+            <m:sub>
+              <m:r>
+                <m:rPr>
+                  <m:sty m:val="p"/>
+                </m:rPr>
+                <m:t>L</m:t>
+              </m:r>
+              <m:r>
+                <m:rPr>
+                  <m:sty m:val="p"/>
+                </m:rPr>
+                <m:t>Q</m:t>
+              </m:r>
+              <m:r>
+                <m:rPr>
+                  <m:sty m:val="p"/>
+                </m:rPr>
+                <m:t>R</m:t>
+              </m:r>
+            </m:sub>
+          </m:sSub>
+          <m:r>
+            <m:rPr>
+              <m:sty m:val="p"/>
+            </m:rPr>
+            <m:t>=</m:t>
+          </m:r>
+          <m:sSub>
+            <m:e>
+              <m:r>
+                <m:t>δ</m:t>
+              </m:r>
+            </m:e>
+            <m:sub>
+              <m:r>
+                <m:rPr>
+                  <m:sty m:val="p"/>
+                </m:rPr>
+                <m:t>f</m:t>
+              </m:r>
+              <m:r>
+                <m:rPr>
+                  <m:sty m:val="p"/>
+                </m:rPr>
+                <m:t>f</m:t>
+              </m:r>
+            </m:sub>
+          </m:sSub>
+          <m:r>
+            <m:rPr>
+              <m:sty m:val="p"/>
+            </m:rPr>
+            <m:t>−</m:t>
+          </m:r>
+          <m:r>
+            <m:t>K</m:t>
+          </m:r>
+          <m:d>
+            <m:dPr>
+              <m:begChr m:val="("/>
+              <m:endChr m:val=")"/>
+              <m:sepChr m:val=""/>
+              <m:grow/>
+            </m:dPr>
+            <m:e>
+              <m:sSub>
+                <m:e>
+                  <m:r>
+                    <m:t>v</m:t>
+                  </m:r>
+                </m:e>
+                <m:sub>
+                  <m:r>
+                    <m:t>x</m:t>
+                  </m:r>
+                </m:sub>
+              </m:sSub>
+            </m:e>
+          </m:d>
+          <m:d>
+            <m:dPr>
+              <m:begChr m:val="("/>
+              <m:endChr m:val=")"/>
+              <m:sepChr m:val=""/>
+              <m:grow/>
+            </m:dPr>
+            <m:e>
+              <m:sSub>
+                <m:e>
+                  <m:acc>
+                    <m:accPr>
+                      <m:chr m:val="̂"/>
+                    </m:accPr>
+                    <m:e>
+                      <m:r>
+                        <m:t>x</m:t>
+                      </m:r>
+                    </m:e>
+                  </m:acc>
+                </m:e>
+                <m:sub>
+                  <m:r>
+                    <m:t>e</m:t>
+                  </m:r>
+                </m:sub>
+              </m:sSub>
+              <m:r>
+                <m:rPr>
+                  <m:sty m:val="p"/>
+                </m:rPr>
+                <m:t>−</m:t>
+              </m:r>
+              <m:sSub>
+                <m:e>
+                  <m:r>
+                    <m:t>x</m:t>
+                  </m:r>
+                </m:e>
+                <m:sub>
+                  <m:r>
+                    <m:t>e</m:t>
+                  </m:r>
+                  <m:r>
+                    <m:rPr>
+                      <m:sty m:val="p"/>
+                    </m:rPr>
+                    <m:t>,</m:t>
+                  </m:r>
+                  <m:r>
+                    <m:rPr>
+                      <m:sty m:val="p"/>
+                    </m:rPr>
+                    <m:t>r</m:t>
+                  </m:r>
+                  <m:r>
+                    <m:rPr>
+                      <m:sty m:val="p"/>
+                    </m:rPr>
+                    <m:t>e</m:t>
+                  </m:r>
+                  <m:r>
+                    <m:rPr>
+                      <m:sty m:val="p"/>
+                    </m:rPr>
+                    <m:t>f</m:t>
+                  </m:r>
+                </m:sub>
+              </m:sSub>
+            </m:e>
+          </m:d>
+          <m:r>
+            <m:rPr>
+              <m:sty m:val="p"/>
+            </m:rPr>
+            <m:t>.</m:t>
+          </m:r>
+        </m:oMath>
+      </m:oMathPara>
     </w:p>
     <w:bookmarkEnd w:id="25"/>
     <w:bookmarkStart w:id="26" w:name="causal-residual-policy"/>
@@ -2880,31 +3876,120 @@
       <w:pPr>
         <w:pStyle w:val="BodyText"/>
       </w:pPr>
-      <w:r>
-        <w:t xml:space="preserve">[</w:t>
-      </w:r>
-      <w:r>
-        <w:t xml:space="preserve"> </w:t>
-      </w:r>
-      <w:r>
-        <w:t xml:space="preserve">J(w)</w:t>
-      </w:r>
-      <w:r>
-        <w:t xml:space="preserve">J(0)-</w:t>
-      </w:r>
-      <w:r>
-        <w:t xml:space="preserve">(10^{-7},0.01J(0))</w:t>
-      </w:r>
-      <w:r>
-        <w:t xml:space="preserve"> </w:t>
-      </w:r>
-      <w:r>
-        <w:t xml:space="preserve">]</w:t>
-      </w:r>
-    </w:p>
-    <w:p>
-      <w:pPr>
-        <w:pStyle w:val="BodyText"/>
+      <m:oMathPara>
+        <m:oMathParaPr>
+          <m:jc m:val="center"/>
+        </m:oMathParaPr>
+        <m:oMath>
+          <m:r>
+            <m:t>J</m:t>
+          </m:r>
+          <m:d>
+            <m:dPr>
+              <m:begChr m:val="("/>
+              <m:endChr m:val=")"/>
+              <m:sepChr m:val=""/>
+              <m:grow/>
+            </m:dPr>
+            <m:e>
+              <m:r>
+                <m:t>w</m:t>
+              </m:r>
+            </m:e>
+          </m:d>
+          <m:r>
+            <m:rPr>
+              <m:sty m:val="p"/>
+            </m:rPr>
+            <m:t>≤</m:t>
+          </m:r>
+          <m:r>
+            <m:t>J</m:t>
+          </m:r>
+          <m:d>
+            <m:dPr>
+              <m:begChr m:val="("/>
+              <m:endChr m:val=")"/>
+              <m:sepChr m:val=""/>
+              <m:grow/>
+            </m:dPr>
+            <m:e>
+              <m:r>
+                <m:t>0</m:t>
+              </m:r>
+            </m:e>
+          </m:d>
+          <m:r>
+            <m:rPr>
+              <m:sty m:val="p"/>
+            </m:rPr>
+            <m:t>−</m:t>
+          </m:r>
+          <m:r>
+            <m:rPr>
+              <m:sty m:val="p"/>
+            </m:rPr>
+            <m:t>max</m:t>
+          </m:r>
+          <m:d>
+            <m:dPr>
+              <m:begChr m:val="("/>
+              <m:endChr m:val=")"/>
+              <m:sepChr m:val=""/>
+              <m:grow/>
+            </m:dPr>
+            <m:e>
+              <m:sSup>
+                <m:e>
+                  <m:r>
+                    <m:t>10</m:t>
+                  </m:r>
+                </m:e>
+                <m:sup>
+                  <m:r>
+                    <m:rPr>
+                      <m:sty m:val="p"/>
+                    </m:rPr>
+                    <m:t>−</m:t>
+                  </m:r>
+                  <m:r>
+                    <m:t>7</m:t>
+                  </m:r>
+                </m:sup>
+              </m:sSup>
+              <m:r>
+                <m:rPr>
+                  <m:sty m:val="p"/>
+                </m:rPr>
+                <m:t>,</m:t>
+              </m:r>
+              <m:r>
+                <m:t>0.01</m:t>
+              </m:r>
+              <m:r>
+                <m:t>J</m:t>
+              </m:r>
+              <m:d>
+                <m:dPr>
+                  <m:begChr m:val="("/>
+                  <m:endChr m:val=")"/>
+                  <m:sepChr m:val=""/>
+                  <m:grow/>
+                </m:dPr>
+                <m:e>
+                  <m:r>
+                    <m:t>0</m:t>
+                  </m:r>
+                </m:e>
+              </m:d>
+            </m:e>
+          </m:d>
+        </m:oMath>
+      </m:oMathPara>
+    </w:p>
+    <w:p>
+      <w:pPr>
+        <w:pStyle w:val="FirstParagraph"/>
       </w:pPr>
       <w:r>
         <w:t xml:space="preserve">is required before admission. Candidate caps are0.1/0.25/0.5, age-adjusted, with</w:t>
@@ -2956,79 +4041,378 @@
       <w:pPr>
         <w:pStyle w:val="BodyText"/>
       </w:pPr>
-      <w:r>
-        <w:t xml:space="preserve">[</w:t>
-      </w:r>
-      <w:r>
-        <w:t xml:space="preserve"> </w:t>
-      </w:r>
-      <w:r>
-        <w:t xml:space="preserve">r_t=-</w:t>
-      </w:r>
-      <w:r>
-        <w:t xml:space="preserve">(</w:t>
-      </w:r>
-      <w:r>
-        <w:t xml:space="preserve">)^2</w:t>
-      </w:r>
-      <w:r>
-        <w:t xml:space="preserve"> </w:t>
-      </w:r>
-      <w:r>
-        <w:t xml:space="preserve">-0.2</w:t>
-      </w:r>
-      <w:r>
-        <w:t xml:space="preserve">(</w:t>
-      </w:r>
-      <w:r>
-        <w:t xml:space="preserve">)^2</w:t>
-      </w:r>
-      <w:r>
-        <w:t xml:space="preserve"> </w:t>
-      </w:r>
-      <w:r>
-        <w:t xml:space="preserve">-0.005</w:t>
-      </w:r>
-      <w:r>
-        <w:t xml:space="preserve">(</w:t>
-      </w:r>
-      <w:r>
-        <w:t xml:space="preserve">)^2</w:t>
-      </w:r>
-      <w:r>
-        <w:t xml:space="preserve"> </w:t>
-      </w:r>
-      <w:r>
-        <w:t xml:space="preserve">-0.001</w:t>
-      </w:r>
-      <w:r>
-        <w:t xml:space="preserve">(</w:t>
-      </w:r>
-      <w:r>
-        <w:t xml:space="preserve">)^2</w:t>
-      </w:r>
-      <w:r>
-        <w:t xml:space="preserve"> </w:t>
-      </w:r>
-      <w:r>
-        <w:t xml:space="preserve">-10</w:t>
-      </w:r>
-      <w:r>
-        <w:t xml:space="preserve">_{</w:t>
-      </w:r>
-      <w:r>
-        <w:t xml:space="preserve">}.</w:t>
-      </w:r>
-      <w:r>
-        <w:t xml:space="preserve"> </w:t>
-      </w:r>
-      <w:r>
-        <w:t xml:space="preserve">]</w:t>
-      </w:r>
-    </w:p>
-    <w:p>
-      <w:pPr>
-        <w:pStyle w:val="BodyText"/>
+      <m:oMathPara>
+        <m:oMathParaPr>
+          <m:jc m:val="center"/>
+        </m:oMathParaPr>
+        <m:oMath>
+          <m:sSub>
+            <m:e>
+              <m:r>
+                <m:t>r</m:t>
+              </m:r>
+            </m:e>
+            <m:sub>
+              <m:r>
+                <m:t>t</m:t>
+              </m:r>
+            </m:sub>
+          </m:sSub>
+          <m:r>
+            <m:rPr>
+              <m:sty m:val="p"/>
+            </m:rPr>
+            <m:t>=</m:t>
+          </m:r>
+          <m:r>
+            <m:rPr>
+              <m:sty m:val="p"/>
+            </m:rPr>
+            <m:t>−</m:t>
+          </m:r>
+          <m:sSup>
+            <m:e>
+              <m:d>
+                <m:dPr>
+                  <m:begChr m:val="("/>
+                  <m:endChr m:val=")"/>
+                  <m:sepChr m:val=""/>
+                  <m:grow/>
+                </m:dPr>
+                <m:e>
+                  <m:f>
+                    <m:fPr>
+                      <m:type m:val="bar"/>
+                    </m:fPr>
+                    <m:num>
+                      <m:sSub>
+                        <m:e>
+                          <m:r>
+                            <m:t>e</m:t>
+                          </m:r>
+                        </m:e>
+                        <m:sub>
+                          <m:r>
+                            <m:t>y</m:t>
+                          </m:r>
+                        </m:sub>
+                      </m:sSub>
+                    </m:num>
+                    <m:den>
+                      <m:r>
+                        <m:t>0.5</m:t>
+                      </m:r>
+                    </m:den>
+                  </m:f>
+                </m:e>
+              </m:d>
+            </m:e>
+            <m:sup>
+              <m:r>
+                <m:t>2</m:t>
+              </m:r>
+            </m:sup>
+          </m:sSup>
+          <m:r>
+            <m:rPr>
+              <m:sty m:val="p"/>
+            </m:rPr>
+            <m:t>−</m:t>
+          </m:r>
+          <m:r>
+            <m:t>0.2</m:t>
+          </m:r>
+          <m:sSup>
+            <m:e>
+              <m:d>
+                <m:dPr>
+                  <m:begChr m:val="("/>
+                  <m:endChr m:val=")"/>
+                  <m:sepChr m:val=""/>
+                  <m:grow/>
+                </m:dPr>
+                <m:e>
+                  <m:f>
+                    <m:fPr>
+                      <m:type m:val="bar"/>
+                    </m:fPr>
+                    <m:num>
+                      <m:sSub>
+                        <m:e>
+                          <m:r>
+                            <m:t>e</m:t>
+                          </m:r>
+                        </m:e>
+                        <m:sub>
+                          <m:r>
+                            <m:t>φ</m:t>
+                          </m:r>
+                        </m:sub>
+                      </m:sSub>
+                    </m:num>
+                    <m:den>
+                      <m:r>
+                        <m:t>0.1</m:t>
+                      </m:r>
+                    </m:den>
+                  </m:f>
+                </m:e>
+              </m:d>
+            </m:e>
+            <m:sup>
+              <m:r>
+                <m:t>2</m:t>
+              </m:r>
+            </m:sup>
+          </m:sSup>
+          <m:r>
+            <m:rPr>
+              <m:sty m:val="p"/>
+            </m:rPr>
+            <m:t>−</m:t>
+          </m:r>
+          <m:r>
+            <m:t>0.005</m:t>
+          </m:r>
+          <m:sSup>
+            <m:e>
+              <m:d>
+                <m:dPr>
+                  <m:begChr m:val="("/>
+                  <m:endChr m:val=")"/>
+                  <m:sepChr m:val=""/>
+                  <m:grow/>
+                </m:dPr>
+                <m:e>
+                  <m:f>
+                    <m:fPr>
+                      <m:type m:val="bar"/>
+                    </m:fPr>
+                    <m:num>
+                      <m:sSub>
+                        <m:e>
+                          <m:r>
+                            <m:t>δ</m:t>
+                          </m:r>
+                        </m:e>
+                        <m:sub>
+                          <m:r>
+                            <m:rPr>
+                              <m:sty m:val="p"/>
+                            </m:rPr>
+                            <m:t>c</m:t>
+                          </m:r>
+                          <m:r>
+                            <m:rPr>
+                              <m:sty m:val="p"/>
+                            </m:rPr>
+                            <m:t>m</m:t>
+                          </m:r>
+                          <m:r>
+                            <m:rPr>
+                              <m:sty m:val="p"/>
+                            </m:rPr>
+                            <m:t>d</m:t>
+                          </m:r>
+                        </m:sub>
+                      </m:sSub>
+                    </m:num>
+                    <m:den>
+                      <m:r>
+                        <m:t>0.5</m:t>
+                      </m:r>
+                    </m:den>
+                  </m:f>
+                </m:e>
+              </m:d>
+            </m:e>
+            <m:sup>
+              <m:r>
+                <m:t>2</m:t>
+              </m:r>
+            </m:sup>
+          </m:sSup>
+          <m:r>
+            <m:rPr>
+              <m:sty m:val="p"/>
+            </m:rPr>
+            <m:t>−</m:t>
+          </m:r>
+          <m:r>
+            <m:t>0.001</m:t>
+          </m:r>
+          <m:sSup>
+            <m:e>
+              <m:d>
+                <m:dPr>
+                  <m:begChr m:val="("/>
+                  <m:endChr m:val=")"/>
+                  <m:sepChr m:val=""/>
+                  <m:grow/>
+                </m:dPr>
+                <m:e>
+                  <m:f>
+                    <m:fPr>
+                      <m:type m:val="bar"/>
+                    </m:fPr>
+                    <m:num>
+                      <m:sSub>
+                        <m:e>
+                          <m:r>
+                            <m:t>δ</m:t>
+                          </m:r>
+                        </m:e>
+                        <m:sub>
+                          <m:r>
+                            <m:rPr>
+                              <m:sty m:val="p"/>
+                            </m:rPr>
+                            <m:t>c</m:t>
+                          </m:r>
+                          <m:r>
+                            <m:rPr>
+                              <m:sty m:val="p"/>
+                            </m:rPr>
+                            <m:t>m</m:t>
+                          </m:r>
+                          <m:r>
+                            <m:rPr>
+                              <m:sty m:val="p"/>
+                            </m:rPr>
+                            <m:t>d</m:t>
+                          </m:r>
+                        </m:sub>
+                      </m:sSub>
+                      <m:r>
+                        <m:rPr>
+                          <m:sty m:val="p"/>
+                        </m:rPr>
+                        <m:t>−</m:t>
+                      </m:r>
+                      <m:sSub>
+                        <m:e>
+                          <m:r>
+                            <m:t>δ</m:t>
+                          </m:r>
+                        </m:e>
+                        <m:sub>
+                          <m:r>
+                            <m:rPr>
+                              <m:sty m:val="p"/>
+                            </m:rPr>
+                            <m:t>p</m:t>
+                          </m:r>
+                          <m:r>
+                            <m:rPr>
+                              <m:sty m:val="p"/>
+                            </m:rPr>
+                            <m:t>r</m:t>
+                          </m:r>
+                          <m:r>
+                            <m:rPr>
+                              <m:sty m:val="p"/>
+                            </m:rPr>
+                            <m:t>e</m:t>
+                          </m:r>
+                          <m:r>
+                            <m:rPr>
+                              <m:sty m:val="p"/>
+                            </m:rPr>
+                            <m:t>v</m:t>
+                          </m:r>
+                        </m:sub>
+                      </m:sSub>
+                    </m:num>
+                    <m:den>
+                      <m:r>
+                        <m:t>0.005</m:t>
+                      </m:r>
+                    </m:den>
+                  </m:f>
+                </m:e>
+              </m:d>
+            </m:e>
+            <m:sup>
+              <m:r>
+                <m:t>2</m:t>
+              </m:r>
+            </m:sup>
+          </m:sSup>
+          <m:r>
+            <m:rPr>
+              <m:sty m:val="p"/>
+            </m:rPr>
+            <m:t>−</m:t>
+          </m:r>
+          <m:r>
+            <m:t>10</m:t>
+          </m:r>
+          <m:sSub>
+            <m:e>
+              <m:r>
+                <m:rPr>
+                  <m:sty m:val="b"/>
+                </m:rPr>
+                <m:t>1</m:t>
+              </m:r>
+            </m:e>
+            <m:sub>
+              <m:r>
+                <m:rPr>
+                  <m:sty m:val="p"/>
+                </m:rPr>
+                <m:t>f</m:t>
+              </m:r>
+              <m:r>
+                <m:rPr>
+                  <m:sty m:val="p"/>
+                </m:rPr>
+                <m:t>a</m:t>
+              </m:r>
+              <m:r>
+                <m:rPr>
+                  <m:sty m:val="p"/>
+                </m:rPr>
+                <m:t>i</m:t>
+              </m:r>
+              <m:r>
+                <m:rPr>
+                  <m:sty m:val="p"/>
+                </m:rPr>
+                <m:t>l</m:t>
+              </m:r>
+              <m:r>
+                <m:rPr>
+                  <m:sty m:val="p"/>
+                </m:rPr>
+                <m:t>u</m:t>
+              </m:r>
+              <m:r>
+                <m:rPr>
+                  <m:sty m:val="p"/>
+                </m:rPr>
+                <m:t>r</m:t>
+              </m:r>
+              <m:r>
+                <m:rPr>
+                  <m:sty m:val="p"/>
+                </m:rPr>
+                <m:t>e</m:t>
+              </m:r>
+            </m:sub>
+          </m:sSub>
+          <m:r>
+            <m:rPr>
+              <m:sty m:val="p"/>
+            </m:rPr>
+            <m:t>.</m:t>
+          </m:r>
+        </m:oMath>
+      </m:oMathPara>
+    </w:p>
+    <w:p>
+      <w:pPr>
+        <w:pStyle w:val="FirstParagraph"/>
       </w:pPr>
       <w:r>
         <w:t xml:space="preserve">No exogenous computation-delay penalty or privileged counterfactual reward is</w:t>
@@ -4067,6 +5451,14 @@
         <w:t xml:space="preserve">See the frozen protocol, raw traces, independent audits and completion-matrix.md. Reserved confirmation remains unopened when development fails.</w:t>
       </w:r>
     </w:p>
+    <w:p>
+      <w:pPr>
+        <w:pStyle w:val="BodyText"/>
+      </w:pPr>
+      <w:r>
+        <w:t xml:space="preserve">The manuscript-inspired latency-gain comparator reduces lateral RMSE by 5.640%, but increases heading RMSE by 1.428% and steering-rate RMS by 74.192%. This exceeds the predefined5% smoothness tradeoff limit. Fixed authority loses one episode under20ms service. The simple gain is a promising descriptive tracking result, not a selected balanced winner. Same-gain student/constant controls and separate native/timing validation would be needed to attribute its benefit to additional PPO learning. The proposed predictive supervisor did not retain that tracking gain; no post-result gate tuning or reserved-test opening was performed.</w:t>
+      </w:r>
+    </w:p>
     <w:bookmarkEnd w:id="31"/>
     <w:bookmarkStart w:id="32" w:name="stability-and-claim-boundaries"/>
     <w:p>
@@ -4352,37 +5744,224 @@
       <w:pPr>
         <w:pStyle w:val="BodyText"/>
       </w:pPr>
-      <w:r>
-        <w:t xml:space="preserve">[</w:t>
-      </w:r>
-      <w:r>
-        <w:t xml:space="preserve"> </w:t>
-      </w:r>
-      <w:r>
-        <w:t xml:space="preserve">V</w:t>
-      </w:r>
-      <w:r>
-        <w:t xml:space="preserve">-</w:t>
-      </w:r>
-      <w:r>
-        <w:t xml:space="preserve">|x|^2+</w:t>
-      </w:r>
-      <w:r>
-        <w:t xml:space="preserve"> </w:t>
-      </w:r>
-      <w:r>
-        <w:t xml:space="preserve">|d|^2.</w:t>
-      </w:r>
-      <w:r>
-        <w:t xml:space="preserve"> </w:t>
-      </w:r>
-      <w:r>
-        <w:t xml:space="preserve">]</w:t>
-      </w:r>
-    </w:p>
-    <w:p>
-      <w:pPr>
-        <w:pStyle w:val="BodyText"/>
+      <m:oMathPara>
+        <m:oMathParaPr>
+          <m:jc m:val="center"/>
+        </m:oMathParaPr>
+        <m:oMath>
+          <m:acc>
+            <m:accPr>
+              <m:chr m:val="̇"/>
+            </m:accPr>
+            <m:e>
+              <m:r>
+                <m:t>V</m:t>
+              </m:r>
+            </m:e>
+          </m:acc>
+          <m:r>
+            <m:rPr>
+              <m:sty m:val="p"/>
+            </m:rPr>
+            <m:t>≤</m:t>
+          </m:r>
+          <m:r>
+            <m:rPr>
+              <m:sty m:val="p"/>
+            </m:rPr>
+            <m:t>−</m:t>
+          </m:r>
+          <m:f>
+            <m:fPr>
+              <m:type m:val="bar"/>
+            </m:fPr>
+            <m:num>
+              <m:sSub>
+                <m:e>
+                  <m:r>
+                    <m:t>λ</m:t>
+                  </m:r>
+                </m:e>
+                <m:sub>
+                  <m:r>
+                    <m:rPr>
+                      <m:sty m:val="p"/>
+                    </m:rPr>
+                    <m:t>min</m:t>
+                  </m:r>
+                </m:sub>
+              </m:sSub>
+              <m:d>
+                <m:dPr>
+                  <m:begChr m:val="("/>
+                  <m:endChr m:val=")"/>
+                  <m:sepChr m:val=""/>
+                  <m:grow/>
+                </m:dPr>
+                <m:e>
+                  <m:sSub>
+                    <m:e>
+                      <m:r>
+                        <m:t>Q</m:t>
+                      </m:r>
+                    </m:e>
+                    <m:sub>
+                      <m:r>
+                        <m:t>c</m:t>
+                      </m:r>
+                    </m:sub>
+                  </m:sSub>
+                </m:e>
+              </m:d>
+            </m:num>
+            <m:den>
+              <m:r>
+                <m:t>2</m:t>
+              </m:r>
+            </m:den>
+          </m:f>
+          <m:r>
+            <m:rPr>
+              <m:sty m:val="p"/>
+            </m:rPr>
+            <m:t>∥</m:t>
+          </m:r>
+          <m:r>
+            <m:t>x</m:t>
+          </m:r>
+          <m:sSup>
+            <m:e>
+              <m:r>
+                <m:rPr>
+                  <m:sty m:val="p"/>
+                </m:rPr>
+                <m:t>∥</m:t>
+              </m:r>
+            </m:e>
+            <m:sup>
+              <m:r>
+                <m:t>2</m:t>
+              </m:r>
+            </m:sup>
+          </m:sSup>
+          <m:r>
+            <m:rPr>
+              <m:sty m:val="p"/>
+            </m:rPr>
+            <m:t>+</m:t>
+          </m:r>
+          <m:f>
+            <m:fPr>
+              <m:type m:val="bar"/>
+            </m:fPr>
+            <m:num>
+              <m:r>
+                <m:t>2</m:t>
+              </m:r>
+              <m:r>
+                <m:rPr>
+                  <m:sty m:val="p"/>
+                </m:rPr>
+                <m:t>∥</m:t>
+              </m:r>
+              <m:r>
+                <m:t>P</m:t>
+              </m:r>
+              <m:r>
+                <m:t>B</m:t>
+              </m:r>
+              <m:sSup>
+                <m:e>
+                  <m:r>
+                    <m:rPr>
+                      <m:sty m:val="p"/>
+                    </m:rPr>
+                    <m:t>∥</m:t>
+                  </m:r>
+                </m:e>
+                <m:sup>
+                  <m:r>
+                    <m:t>2</m:t>
+                  </m:r>
+                </m:sup>
+              </m:sSup>
+            </m:num>
+            <m:den>
+              <m:sSub>
+                <m:e>
+                  <m:r>
+                    <m:t>λ</m:t>
+                  </m:r>
+                </m:e>
+                <m:sub>
+                  <m:r>
+                    <m:rPr>
+                      <m:sty m:val="p"/>
+                    </m:rPr>
+                    <m:t>min</m:t>
+                  </m:r>
+                </m:sub>
+              </m:sSub>
+              <m:d>
+                <m:dPr>
+                  <m:begChr m:val="("/>
+                  <m:endChr m:val=")"/>
+                  <m:sepChr m:val=""/>
+                  <m:grow/>
+                </m:dPr>
+                <m:e>
+                  <m:sSub>
+                    <m:e>
+                      <m:r>
+                        <m:t>Q</m:t>
+                      </m:r>
+                    </m:e>
+                    <m:sub>
+                      <m:r>
+                        <m:t>c</m:t>
+                      </m:r>
+                    </m:sub>
+                  </m:sSub>
+                </m:e>
+              </m:d>
+            </m:den>
+          </m:f>
+          <m:r>
+            <m:rPr>
+              <m:sty m:val="p"/>
+            </m:rPr>
+            <m:t>∥</m:t>
+          </m:r>
+          <m:r>
+            <m:t>d</m:t>
+          </m:r>
+          <m:sSup>
+            <m:e>
+              <m:r>
+                <m:rPr>
+                  <m:sty m:val="p"/>
+                </m:rPr>
+                <m:t>∥</m:t>
+              </m:r>
+            </m:e>
+            <m:sup>
+              <m:r>
+                <m:t>2</m:t>
+              </m:r>
+            </m:sup>
+          </m:sSup>
+          <m:r>
+            <m:rPr>
+              <m:sty m:val="p"/>
+            </m:rPr>
+            <m:t>.</m:t>
+          </m:r>
+        </m:oMath>
+      </m:oMathPara>
+    </w:p>
+    <w:p>
+      <w:pPr>
+        <w:pStyle w:val="FirstParagraph"/>
       </w:pPr>
       <w:r>
         <w:t xml:space="preserve">This conditional bound does not imply zero convergence under nonzero residuals,</w:t>

</xml_diff>